<commit_message>
izmjena uputa za spajanje s bazom
</commit_message>
<xml_diff>
--- a/DZ03/FitnessStudio_upute_instalacija_pokretanje.docx
+++ b/DZ03/FitnessStudio_upute_instalacija_pokretanje.docx
@@ -28,7 +28,21 @@
         <w:rPr>
           <w:i/>
         </w:rPr>
-        <w:t xml:space="preserve">Dokument s uputama za </w:t>
+        <w:t xml:space="preserve">Dokument s </w:t>
+      </w:r>
+      <w:proofErr w:type="spellStart"/>
+      <w:r>
+        <w:rPr>
+          <w:i/>
+        </w:rPr>
+        <w:t>uputama</w:t>
+      </w:r>
+      <w:proofErr w:type="spellEnd"/>
+      <w:r>
+        <w:rPr>
+          <w:i/>
+        </w:rPr>
+        <w:t xml:space="preserve"> za </w:t>
       </w:r>
       <w:proofErr w:type="spellStart"/>
       <w:r>
@@ -703,7 +717,23 @@
         <w:spacing w:after="100"/>
       </w:pPr>
       <w:r>
-        <w:t xml:space="preserve">Napomena: tijekom implementacije napravljene su određene izmjene u odnosu na raniju verziju baze podataka, pa je za ispravno pokretanje i testiranje aplikacije potrebno koristiti novu verziju SQL skripti koje se nalaze </w:t>
+        <w:t xml:space="preserve">Napomena: tijekom implementacije napravljene su određene izmjene u odnosu na raniju verziju baze podataka, pa je za ispravno pokretanje i testiranje aplikacije potrebno koristiti novu verziju SQL skripti </w:t>
+      </w:r>
+      <w:proofErr w:type="spellStart"/>
+      <w:r>
+        <w:t>koje</w:t>
+      </w:r>
+      <w:proofErr w:type="spellEnd"/>
+      <w:r>
+        <w:t xml:space="preserve"> se </w:t>
+      </w:r>
+      <w:proofErr w:type="spellStart"/>
+      <w:r>
+        <w:t>nalaze</w:t>
+      </w:r>
+      <w:proofErr w:type="spellEnd"/>
+      <w:r>
+        <w:t xml:space="preserve"> </w:t>
       </w:r>
       <w:proofErr w:type="spellStart"/>
       <w:r>
@@ -972,7 +1002,78 @@
         <w:spacing w:after="40"/>
       </w:pPr>
       <w:r>
-        <w:t>`YOUR_PASSWORD` stvarnom PostgreSQL lozinkom</w:t>
+        <w:t xml:space="preserve">`YOUR_PASSWORD` </w:t>
+      </w:r>
+      <w:proofErr w:type="spellStart"/>
+      <w:r>
+        <w:t>stvarnom</w:t>
+      </w:r>
+      <w:proofErr w:type="spellEnd"/>
+      <w:r>
+        <w:t xml:space="preserve"> PostgreSQL </w:t>
+      </w:r>
+      <w:proofErr w:type="spellStart"/>
+      <w:r>
+        <w:t>lozinkom</w:t>
+      </w:r>
+      <w:proofErr w:type="spellEnd"/>
+    </w:p>
+    <w:p>
+      <w:pPr>
+        <w:pStyle w:val="ListBullet"/>
+        <w:spacing w:after="40"/>
+      </w:pPr>
+      <w:r>
+        <w:t xml:space="preserve">Port </w:t>
+      </w:r>
+      <w:proofErr w:type="spellStart"/>
+      <w:r>
+        <w:t>sa</w:t>
+      </w:r>
+      <w:proofErr w:type="spellEnd"/>
+      <w:r>
+        <w:t xml:space="preserve"> </w:t>
+      </w:r>
+      <w:proofErr w:type="spellStart"/>
+      <w:r>
+        <w:t>stvarnim</w:t>
+      </w:r>
+      <w:proofErr w:type="spellEnd"/>
+      <w:r>
+        <w:t xml:space="preserve"> </w:t>
+      </w:r>
+      <w:proofErr w:type="spellStart"/>
+      <w:r>
+        <w:t>portom</w:t>
+      </w:r>
+      <w:proofErr w:type="spellEnd"/>
+      <w:r>
+        <w:t xml:space="preserve"> koji </w:t>
+      </w:r>
+      <w:proofErr w:type="spellStart"/>
+      <w:r>
+        <w:t>koristi</w:t>
+      </w:r>
+      <w:proofErr w:type="spellEnd"/>
+      <w:r>
+        <w:t xml:space="preserve"> server </w:t>
+      </w:r>
+      <w:proofErr w:type="spellStart"/>
+      <w:r>
+        <w:t>va</w:t>
+      </w:r>
+      <w:r>
+        <w:rPr>
+          <w:lang w:val="hr-HR"/>
+        </w:rPr>
+        <w:t>še</w:t>
+      </w:r>
+      <w:proofErr w:type="spellEnd"/>
+      <w:r>
+        <w:rPr>
+          <w:lang w:val="hr-HR"/>
+        </w:rPr>
+        <w:t xml:space="preserve"> baze podataka</w:t>
       </w:r>
     </w:p>
     <w:p>
@@ -1154,8 +1255,21 @@
       <w:pPr>
         <w:spacing w:after="100"/>
       </w:pPr>
-      <w:r>
-        <w:t xml:space="preserve">Početna stranica </w:t>
+      <w:proofErr w:type="spellStart"/>
+      <w:r>
+        <w:t>Početna</w:t>
+      </w:r>
+      <w:proofErr w:type="spellEnd"/>
+      <w:r>
+        <w:t xml:space="preserve"> </w:t>
+      </w:r>
+      <w:proofErr w:type="spellStart"/>
+      <w:r>
+        <w:t>stranica</w:t>
+      </w:r>
+      <w:proofErr w:type="spellEnd"/>
+      <w:r>
+        <w:t xml:space="preserve"> </w:t>
       </w:r>
       <w:proofErr w:type="spellStart"/>
       <w:r>

</xml_diff>

<commit_message>
dodane upute za testiranje
</commit_message>
<xml_diff>
--- a/DZ03/FitnessStudio_upute_instalacija_pokretanje.docx
+++ b/DZ03/FitnessStudio_upute_instalacija_pokretanje.docx
@@ -28,119 +28,7 @@
         <w:rPr>
           <w:i/>
         </w:rPr>
-        <w:t xml:space="preserve">Dokument s </w:t>
-      </w:r>
-      <w:proofErr w:type="spellStart"/>
-      <w:r>
-        <w:rPr>
-          <w:i/>
-        </w:rPr>
-        <w:t>uputama</w:t>
-      </w:r>
-      <w:proofErr w:type="spellEnd"/>
-      <w:r>
-        <w:rPr>
-          <w:i/>
-        </w:rPr>
-        <w:t xml:space="preserve"> za </w:t>
-      </w:r>
-      <w:proofErr w:type="spellStart"/>
-      <w:r>
-        <w:rPr>
-          <w:i/>
-        </w:rPr>
-        <w:t>instalaciju</w:t>
-      </w:r>
-      <w:proofErr w:type="spellEnd"/>
-      <w:r>
-        <w:rPr>
-          <w:i/>
-        </w:rPr>
-        <w:t xml:space="preserve">, </w:t>
-      </w:r>
-      <w:proofErr w:type="spellStart"/>
-      <w:r>
-        <w:rPr>
-          <w:i/>
-        </w:rPr>
-        <w:t>postavljanje</w:t>
-      </w:r>
-      <w:proofErr w:type="spellEnd"/>
-      <w:r>
-        <w:rPr>
-          <w:i/>
-        </w:rPr>
-        <w:t xml:space="preserve"> </w:t>
-      </w:r>
-      <w:proofErr w:type="spellStart"/>
-      <w:r>
-        <w:rPr>
-          <w:i/>
-        </w:rPr>
-        <w:t>baze</w:t>
-      </w:r>
-      <w:proofErr w:type="spellEnd"/>
-      <w:r>
-        <w:rPr>
-          <w:i/>
-        </w:rPr>
-        <w:t xml:space="preserve"> </w:t>
-      </w:r>
-      <w:proofErr w:type="spellStart"/>
-      <w:r>
-        <w:rPr>
-          <w:i/>
-        </w:rPr>
-        <w:t>podataka</w:t>
-      </w:r>
-      <w:proofErr w:type="spellEnd"/>
-      <w:r>
-        <w:rPr>
-          <w:i/>
-        </w:rPr>
-        <w:t xml:space="preserve"> </w:t>
-      </w:r>
-      <w:proofErr w:type="spellStart"/>
-      <w:r>
-        <w:rPr>
-          <w:i/>
-        </w:rPr>
-        <w:t>i</w:t>
-      </w:r>
-      <w:proofErr w:type="spellEnd"/>
-      <w:r>
-        <w:rPr>
-          <w:i/>
-        </w:rPr>
-        <w:t xml:space="preserve"> </w:t>
-      </w:r>
-      <w:proofErr w:type="spellStart"/>
-      <w:r>
-        <w:rPr>
-          <w:i/>
-        </w:rPr>
-        <w:t>pokretanje</w:t>
-      </w:r>
-      <w:proofErr w:type="spellEnd"/>
-      <w:r>
-        <w:rPr>
-          <w:i/>
-        </w:rPr>
-        <w:t xml:space="preserve"> </w:t>
-      </w:r>
-      <w:proofErr w:type="spellStart"/>
-      <w:r>
-        <w:rPr>
-          <w:i/>
-        </w:rPr>
-        <w:t>aplikacije</w:t>
-      </w:r>
-      <w:proofErr w:type="spellEnd"/>
-      <w:r>
-        <w:rPr>
-          <w:i/>
-        </w:rPr>
-        <w:t>.</w:t>
+        <w:t>Dokument s uputama za instalaciju, postavljanje baze podataka i pokretanje aplikacije.</w:t>
       </w:r>
     </w:p>
     <w:p>
@@ -156,55 +44,7 @@
           <w:iCs/>
           <w:color w:val="1F497D" w:themeColor="text2"/>
         </w:rPr>
-        <w:t xml:space="preserve">Link </w:t>
-      </w:r>
-      <w:proofErr w:type="spellStart"/>
-      <w:r>
-        <w:rPr>
-          <w:iCs/>
-          <w:color w:val="1F497D" w:themeColor="text2"/>
-        </w:rPr>
-        <w:t>na</w:t>
-      </w:r>
-      <w:proofErr w:type="spellEnd"/>
-      <w:r>
-        <w:rPr>
-          <w:iCs/>
-          <w:color w:val="1F497D" w:themeColor="text2"/>
-        </w:rPr>
-        <w:t xml:space="preserve"> </w:t>
-      </w:r>
-      <w:proofErr w:type="spellStart"/>
-      <w:r>
-        <w:rPr>
-          <w:iCs/>
-          <w:color w:val="1F497D" w:themeColor="text2"/>
-        </w:rPr>
-        <w:t>github</w:t>
-      </w:r>
-      <w:proofErr w:type="spellEnd"/>
-      <w:r>
-        <w:rPr>
-          <w:iCs/>
-          <w:color w:val="1F497D" w:themeColor="text2"/>
-        </w:rPr>
-        <w:t xml:space="preserve"> </w:t>
-      </w:r>
-      <w:proofErr w:type="spellStart"/>
-      <w:r>
-        <w:rPr>
-          <w:iCs/>
-          <w:color w:val="1F497D" w:themeColor="text2"/>
-        </w:rPr>
-        <w:t>repozitorij</w:t>
-      </w:r>
-      <w:proofErr w:type="spellEnd"/>
-      <w:r>
-        <w:rPr>
-          <w:iCs/>
-          <w:color w:val="1F497D" w:themeColor="text2"/>
-        </w:rPr>
-        <w:t xml:space="preserve">: </w:t>
+        <w:t xml:space="preserve">Link na github repozitorij: </w:t>
       </w:r>
       <w:r>
         <w:rPr>
@@ -717,66 +557,10 @@
         <w:spacing w:after="100"/>
       </w:pPr>
       <w:r>
-        <w:t xml:space="preserve">Napomena: tijekom implementacije napravljene su određene izmjene u odnosu na raniju verziju baze podataka, pa je za ispravno pokretanje i testiranje aplikacije potrebno koristiti novu verziju SQL skripti </w:t>
-      </w:r>
-      <w:proofErr w:type="spellStart"/>
-      <w:r>
-        <w:t>koje</w:t>
-      </w:r>
-      <w:proofErr w:type="spellEnd"/>
-      <w:r>
-        <w:t xml:space="preserve"> se </w:t>
-      </w:r>
-      <w:proofErr w:type="spellStart"/>
-      <w:r>
-        <w:t>nalaze</w:t>
-      </w:r>
-      <w:proofErr w:type="spellEnd"/>
-      <w:r>
-        <w:t xml:space="preserve"> </w:t>
-      </w:r>
-      <w:proofErr w:type="spellStart"/>
-      <w:r>
-        <w:t>uz</w:t>
-      </w:r>
-      <w:proofErr w:type="spellEnd"/>
-      <w:r>
-        <w:t xml:space="preserve"> </w:t>
-      </w:r>
-      <w:proofErr w:type="spellStart"/>
-      <w:r>
-        <w:t>ovu</w:t>
-      </w:r>
-      <w:proofErr w:type="spellEnd"/>
-      <w:r>
-        <w:t xml:space="preserve"> </w:t>
-      </w:r>
-      <w:proofErr w:type="spellStart"/>
-      <w:r>
-        <w:t>predaj</w:t>
+        <w:t>Napomena: tijekom implementacije napravljene su određene izmjene u odnosu na raniju verziju baze podataka, pa je za ispravno pokretanje i testiranje aplikacije potrebno koristiti novu verziju SQL skripti koje se nalaze uz ovu predaj</w:t>
       </w:r>
       <w:r>
-        <w:t>u</w:t>
-      </w:r>
-      <w:proofErr w:type="spellEnd"/>
-      <w:r>
-        <w:t xml:space="preserve">, u </w:t>
-      </w:r>
-      <w:proofErr w:type="spellStart"/>
-      <w:r>
-        <w:t>direktoriju</w:t>
-      </w:r>
-      <w:proofErr w:type="spellEnd"/>
-      <w:r>
-        <w:t xml:space="preserve"> “</w:t>
-      </w:r>
-      <w:proofErr w:type="spellStart"/>
-      <w:r>
-        <w:t>prilozi</w:t>
-      </w:r>
-      <w:proofErr w:type="spellEnd"/>
-      <w:r>
-        <w:t>”.</w:t>
+        <w:t>u, u direktoriju “prilozi”.</w:t>
       </w:r>
     </w:p>
     <w:p>
@@ -923,7 +707,7 @@
         <w:spacing w:after="100"/>
       </w:pPr>
       <w:r>
-        <w:t>Preporučuje se lokalno postaviti datoteku `FitnessStudio.Web/appsettings.Development.json`.</w:t>
+        <w:t>Preporučuje se lokalno postaviti datoteku `FitnessStudio.Web/appsettings.json`.</w:t>
       </w:r>
     </w:p>
     <w:p>
@@ -1002,21 +786,8 @@
         <w:spacing w:after="40"/>
       </w:pPr>
       <w:r>
-        <w:t xml:space="preserve">`YOUR_PASSWORD` </w:t>
+        <w:t>`YOUR_PASSWORD` stvarnom PostgreSQL lozinkom</w:t>
       </w:r>
-      <w:proofErr w:type="spellStart"/>
-      <w:r>
-        <w:t>stvarnom</w:t>
-      </w:r>
-      <w:proofErr w:type="spellEnd"/>
-      <w:r>
-        <w:t xml:space="preserve"> PostgreSQL </w:t>
-      </w:r>
-      <w:proofErr w:type="spellStart"/>
-      <w:r>
-        <w:t>lozinkom</w:t>
-      </w:r>
-      <w:proofErr w:type="spellEnd"/>
     </w:p>
     <w:p>
       <w:pPr>
@@ -1024,56 +795,13 @@
         <w:spacing w:after="40"/>
       </w:pPr>
       <w:r>
-        <w:t xml:space="preserve">Port </w:t>
-      </w:r>
-      <w:proofErr w:type="spellStart"/>
-      <w:r>
-        <w:t>sa</w:t>
-      </w:r>
-      <w:proofErr w:type="spellEnd"/>
-      <w:r>
-        <w:t xml:space="preserve"> </w:t>
-      </w:r>
-      <w:proofErr w:type="spellStart"/>
-      <w:r>
-        <w:t>stvarnim</w:t>
-      </w:r>
-      <w:proofErr w:type="spellEnd"/>
-      <w:r>
-        <w:t xml:space="preserve"> </w:t>
-      </w:r>
-      <w:proofErr w:type="spellStart"/>
-      <w:r>
-        <w:t>portom</w:t>
-      </w:r>
-      <w:proofErr w:type="spellEnd"/>
-      <w:r>
-        <w:t xml:space="preserve"> koji </w:t>
-      </w:r>
-      <w:proofErr w:type="spellStart"/>
-      <w:r>
-        <w:t>koristi</w:t>
-      </w:r>
-      <w:proofErr w:type="spellEnd"/>
-      <w:r>
-        <w:t xml:space="preserve"> server </w:t>
-      </w:r>
-      <w:proofErr w:type="spellStart"/>
-      <w:r>
-        <w:t>va</w:t>
+        <w:t>Port sa stvarnim portom koji koristi server va</w:t>
       </w:r>
       <w:r>
         <w:rPr>
           <w:lang w:val="hr-HR"/>
         </w:rPr>
-        <w:t>še</w:t>
-      </w:r>
-      <w:proofErr w:type="spellEnd"/>
-      <w:r>
-        <w:rPr>
-          <w:lang w:val="hr-HR"/>
-        </w:rPr>
-        <w:t xml:space="preserve"> baze podataka</w:t>
+        <w:t>še baze podataka</w:t>
       </w:r>
     </w:p>
     <w:p>
@@ -1110,7 +838,21 @@
           <w:sz w:val="19"/>
         </w:rPr>
         <w:br/>
-        <w:t xml:space="preserve">    "DefaultConnection": "Host=localhost;Port=5432;Database=fitness_studio;Username=enesek;Password=moja_lozinka"</w:t>
+        <w:t xml:space="preserve">    "DefaultConnection": "Host=localhost;Port=5432;Database=fitness_studio;Username=</w:t>
+      </w:r>
+      <w:r>
+        <w:rPr>
+          <w:rFonts w:ascii="Courier New" w:eastAsia="Courier New" w:hAnsi="Courier New"/>
+          <w:sz w:val="19"/>
+        </w:rPr>
+        <w:t>moje_ime</w:t>
+      </w:r>
+      <w:r>
+        <w:rPr>
+          <w:rFonts w:ascii="Courier New" w:eastAsia="Courier New" w:hAnsi="Courier New"/>
+          <w:sz w:val="19"/>
+        </w:rPr>
+        <w:t>;Password=moja_lozinka"</w:t>
       </w:r>
       <w:r>
         <w:rPr>
@@ -1255,77 +997,8 @@
       <w:pPr>
         <w:spacing w:after="100"/>
       </w:pPr>
-      <w:proofErr w:type="spellStart"/>
       <w:r>
-        <w:t>Početna</w:t>
-      </w:r>
-      <w:proofErr w:type="spellEnd"/>
-      <w:r>
-        <w:t xml:space="preserve"> </w:t>
-      </w:r>
-      <w:proofErr w:type="spellStart"/>
-      <w:r>
-        <w:t>stranica</w:t>
-      </w:r>
-      <w:proofErr w:type="spellEnd"/>
-      <w:r>
-        <w:t xml:space="preserve"> </w:t>
-      </w:r>
-      <w:proofErr w:type="spellStart"/>
-      <w:r>
-        <w:t>sadrži</w:t>
-      </w:r>
-      <w:proofErr w:type="spellEnd"/>
-      <w:r>
-        <w:t xml:space="preserve"> </w:t>
-      </w:r>
-      <w:proofErr w:type="spellStart"/>
-      <w:r>
-        <w:t>osnovnu</w:t>
-      </w:r>
-      <w:proofErr w:type="spellEnd"/>
-      <w:r>
-        <w:t xml:space="preserve"> </w:t>
-      </w:r>
-      <w:proofErr w:type="spellStart"/>
-      <w:r>
-        <w:t>navigaciju</w:t>
-      </w:r>
-      <w:proofErr w:type="spellEnd"/>
-      <w:r>
-        <w:t xml:space="preserve"> </w:t>
-      </w:r>
-      <w:proofErr w:type="spellStart"/>
-      <w:r>
-        <w:t>prema</w:t>
-      </w:r>
-      <w:proofErr w:type="spellEnd"/>
-      <w:r>
-        <w:t xml:space="preserve"> </w:t>
-      </w:r>
-      <w:proofErr w:type="spellStart"/>
-      <w:r>
-        <w:t>glavnim</w:t>
-      </w:r>
-      <w:proofErr w:type="spellEnd"/>
-      <w:r>
-        <w:t xml:space="preserve"> </w:t>
-      </w:r>
-      <w:proofErr w:type="spellStart"/>
-      <w:r>
-        <w:t>dijelovima</w:t>
-      </w:r>
-      <w:proofErr w:type="spellEnd"/>
-      <w:r>
-        <w:t xml:space="preserve"> </w:t>
-      </w:r>
-      <w:proofErr w:type="spellStart"/>
-      <w:r>
-        <w:t>sustava</w:t>
-      </w:r>
-      <w:proofErr w:type="spellEnd"/>
-      <w:r>
-        <w:t>.</w:t>
+        <w:t>Početna stranica sadrži osnovnu navigaciju prema glavnim dijelovima sustava.</w:t>
       </w:r>
     </w:p>
     <w:p>
@@ -1337,21 +1010,8 @@
       <w:pPr>
         <w:spacing w:after="100"/>
       </w:pPr>
-      <w:proofErr w:type="spellStart"/>
       <w:r>
-        <w:t>Važne</w:t>
-      </w:r>
-      <w:proofErr w:type="spellEnd"/>
-      <w:r>
-        <w:t xml:space="preserve"> </w:t>
-      </w:r>
-      <w:proofErr w:type="spellStart"/>
-      <w:r>
-        <w:t>napomene</w:t>
-      </w:r>
-      <w:proofErr w:type="spellEnd"/>
-      <w:r>
-        <w:t>:</w:t>
+        <w:t>Važne napomene:</w:t>
       </w:r>
     </w:p>
     <w:p>
@@ -1363,69 +1023,8 @@
         </w:numPr>
         <w:spacing w:after="100"/>
       </w:pPr>
-      <w:proofErr w:type="spellStart"/>
       <w:r>
-        <w:t>Potrebno</w:t>
-      </w:r>
-      <w:proofErr w:type="spellEnd"/>
-      <w:r>
-        <w:t xml:space="preserve"> je </w:t>
-      </w:r>
-      <w:proofErr w:type="spellStart"/>
-      <w:r>
-        <w:t>koristiti</w:t>
-      </w:r>
-      <w:proofErr w:type="spellEnd"/>
-      <w:r>
-        <w:t xml:space="preserve"> </w:t>
-      </w:r>
-      <w:proofErr w:type="spellStart"/>
-      <w:r>
-        <w:t>aktualne</w:t>
-      </w:r>
-      <w:proofErr w:type="spellEnd"/>
-      <w:r>
-        <w:t xml:space="preserve"> SQL </w:t>
-      </w:r>
-      <w:proofErr w:type="spellStart"/>
-      <w:r>
-        <w:t>skripte</w:t>
-      </w:r>
-      <w:proofErr w:type="spellEnd"/>
-      <w:r>
-        <w:t xml:space="preserve"> </w:t>
-      </w:r>
-      <w:proofErr w:type="spellStart"/>
-      <w:r>
-        <w:t>priložene</w:t>
-      </w:r>
-      <w:proofErr w:type="spellEnd"/>
-      <w:r>
-        <w:t xml:space="preserve"> </w:t>
-      </w:r>
-      <w:proofErr w:type="spellStart"/>
-      <w:r>
-        <w:t>uz</w:t>
-      </w:r>
-      <w:proofErr w:type="spellEnd"/>
-      <w:r>
-        <w:t xml:space="preserve"> </w:t>
-      </w:r>
-      <w:proofErr w:type="spellStart"/>
-      <w:r>
-        <w:t>ovu</w:t>
-      </w:r>
-      <w:proofErr w:type="spellEnd"/>
-      <w:r>
-        <w:t xml:space="preserve"> </w:t>
-      </w:r>
-      <w:proofErr w:type="spellStart"/>
-      <w:r>
-        <w:t>zadaću</w:t>
-      </w:r>
-      <w:proofErr w:type="spellEnd"/>
-      <w:r>
-        <w:t>.</w:t>
+        <w:t>Potrebno je koristiti aktualne SQL skripte priložene uz ovu zadaću.</w:t>
       </w:r>
     </w:p>
     <w:p>
@@ -1437,85 +1036,8 @@
         </w:numPr>
         <w:spacing w:after="100"/>
       </w:pPr>
-      <w:proofErr w:type="spellStart"/>
       <w:r>
-        <w:t>Bazu</w:t>
-      </w:r>
-      <w:proofErr w:type="spellEnd"/>
-      <w:r>
-        <w:t xml:space="preserve"> </w:t>
-      </w:r>
-      <w:proofErr w:type="spellStart"/>
-      <w:r>
-        <w:t>podataka</w:t>
-      </w:r>
-      <w:proofErr w:type="spellEnd"/>
-      <w:r>
-        <w:t xml:space="preserve"> </w:t>
-      </w:r>
-      <w:proofErr w:type="spellStart"/>
-      <w:r>
-        <w:t>treba</w:t>
-      </w:r>
-      <w:proofErr w:type="spellEnd"/>
-      <w:r>
-        <w:t xml:space="preserve"> </w:t>
-      </w:r>
-      <w:proofErr w:type="spellStart"/>
-      <w:r>
-        <w:t>prvo</w:t>
-      </w:r>
-      <w:proofErr w:type="spellEnd"/>
-      <w:r>
-        <w:t xml:space="preserve"> </w:t>
-      </w:r>
-      <w:proofErr w:type="spellStart"/>
-      <w:r>
-        <w:t>kreirati</w:t>
-      </w:r>
-      <w:proofErr w:type="spellEnd"/>
-      <w:r>
-        <w:t xml:space="preserve">, </w:t>
-      </w:r>
-      <w:proofErr w:type="spellStart"/>
-      <w:r>
-        <w:t>zatim</w:t>
-      </w:r>
-      <w:proofErr w:type="spellEnd"/>
-      <w:r>
-        <w:t xml:space="preserve"> </w:t>
-      </w:r>
-      <w:proofErr w:type="spellStart"/>
-      <w:r>
-        <w:t>pokrenuti</w:t>
-      </w:r>
-      <w:proofErr w:type="spellEnd"/>
-      <w:r>
-        <w:t xml:space="preserve"> `</w:t>
-      </w:r>
-      <w:proofErr w:type="spellStart"/>
-      <w:r>
-        <w:t>create_tables.sql</w:t>
-      </w:r>
-      <w:proofErr w:type="spellEnd"/>
-      <w:r>
-        <w:t xml:space="preserve">`, a </w:t>
-      </w:r>
-      <w:proofErr w:type="spellStart"/>
-      <w:r>
-        <w:t>nakon</w:t>
-      </w:r>
-      <w:proofErr w:type="spellEnd"/>
-      <w:r>
-        <w:t xml:space="preserve"> toga `</w:t>
-      </w:r>
-      <w:proofErr w:type="spellStart"/>
-      <w:r>
-        <w:t>insert_data.sql</w:t>
-      </w:r>
-      <w:proofErr w:type="spellEnd"/>
-      <w:r>
-        <w:t>`.</w:t>
+        <w:t>Bazu podataka treba prvo kreirati, zatim pokrenuti `create_tables.sql`, a nakon toga `insert_data.sql`.</w:t>
       </w:r>
     </w:p>
     <w:p>
@@ -1528,73 +1050,7 @@
         <w:spacing w:after="100"/>
       </w:pPr>
       <w:r>
-        <w:t>U `</w:t>
-      </w:r>
-      <w:proofErr w:type="spellStart"/>
-      <w:proofErr w:type="gramStart"/>
-      <w:r>
-        <w:t>appsettings.json</w:t>
-      </w:r>
-      <w:proofErr w:type="spellEnd"/>
-      <w:proofErr w:type="gramEnd"/>
-      <w:r>
-        <w:t xml:space="preserve">` </w:t>
-      </w:r>
-      <w:proofErr w:type="spellStart"/>
-      <w:r>
-        <w:t>potrebno</w:t>
-      </w:r>
-      <w:proofErr w:type="spellEnd"/>
-      <w:r>
-        <w:t xml:space="preserve"> je </w:t>
-      </w:r>
-      <w:proofErr w:type="spellStart"/>
-      <w:r>
-        <w:t>upisati</w:t>
-      </w:r>
-      <w:proofErr w:type="spellEnd"/>
-      <w:r>
-        <w:t xml:space="preserve"> </w:t>
-      </w:r>
-      <w:proofErr w:type="spellStart"/>
-      <w:r>
-        <w:t>vlastito</w:t>
-      </w:r>
-      <w:proofErr w:type="spellEnd"/>
-      <w:r>
-        <w:t xml:space="preserve"> PostgreSQL </w:t>
-      </w:r>
-      <w:proofErr w:type="spellStart"/>
-      <w:r>
-        <w:t>korisničko</w:t>
-      </w:r>
-      <w:proofErr w:type="spellEnd"/>
-      <w:r>
-        <w:t xml:space="preserve"> </w:t>
-      </w:r>
-      <w:proofErr w:type="spellStart"/>
-      <w:r>
-        <w:t>ime</w:t>
-      </w:r>
-      <w:proofErr w:type="spellEnd"/>
-      <w:r>
-        <w:t xml:space="preserve"> </w:t>
-      </w:r>
-      <w:proofErr w:type="spellStart"/>
-      <w:r>
-        <w:t>i</w:t>
-      </w:r>
-      <w:proofErr w:type="spellEnd"/>
-      <w:r>
-        <w:t xml:space="preserve"> </w:t>
-      </w:r>
-      <w:proofErr w:type="spellStart"/>
-      <w:r>
-        <w:t>lozinku</w:t>
-      </w:r>
-      <w:proofErr w:type="spellEnd"/>
-      <w:r>
-        <w:t>.</w:t>
+        <w:t>U `appsettings.json` potrebno je upisati vlastito PostgreSQL korisničko ime i lozinku.</w:t>
       </w:r>
     </w:p>
     <w:p>
@@ -1607,119 +1063,7 @@
         <w:spacing w:after="100"/>
       </w:pPr>
       <w:r>
-        <w:t xml:space="preserve">Ako se </w:t>
-      </w:r>
-      <w:proofErr w:type="spellStart"/>
-      <w:r>
-        <w:t>aplikacija</w:t>
-      </w:r>
-      <w:proofErr w:type="spellEnd"/>
-      <w:r>
-        <w:t xml:space="preserve"> ne </w:t>
-      </w:r>
-      <w:proofErr w:type="spellStart"/>
-      <w:r>
-        <w:t>može</w:t>
-      </w:r>
-      <w:proofErr w:type="spellEnd"/>
-      <w:r>
-        <w:t xml:space="preserve"> </w:t>
-      </w:r>
-      <w:proofErr w:type="spellStart"/>
-      <w:r>
-        <w:t>pokrenuti</w:t>
-      </w:r>
-      <w:proofErr w:type="spellEnd"/>
-      <w:r>
-        <w:t xml:space="preserve"> </w:t>
-      </w:r>
-      <w:proofErr w:type="spellStart"/>
-      <w:r>
-        <w:t>zbog</w:t>
-      </w:r>
-      <w:proofErr w:type="spellEnd"/>
-      <w:r>
-        <w:t xml:space="preserve"> </w:t>
-      </w:r>
-      <w:proofErr w:type="spellStart"/>
-      <w:r>
-        <w:t>zauzetog</w:t>
-      </w:r>
-      <w:proofErr w:type="spellEnd"/>
-      <w:r>
-        <w:t xml:space="preserve"> porta, </w:t>
-      </w:r>
-      <w:proofErr w:type="spellStart"/>
-      <w:r>
-        <w:t>potrebno</w:t>
-      </w:r>
-      <w:proofErr w:type="spellEnd"/>
-      <w:r>
-        <w:t xml:space="preserve"> je </w:t>
-      </w:r>
-      <w:proofErr w:type="spellStart"/>
-      <w:r>
-        <w:t>ugasiti</w:t>
-      </w:r>
-      <w:proofErr w:type="spellEnd"/>
-      <w:r>
-        <w:t xml:space="preserve"> </w:t>
-      </w:r>
-      <w:proofErr w:type="spellStart"/>
-      <w:r>
-        <w:t>prethodno</w:t>
-      </w:r>
-      <w:proofErr w:type="spellEnd"/>
-      <w:r>
-        <w:t xml:space="preserve"> </w:t>
-      </w:r>
-      <w:proofErr w:type="spellStart"/>
-      <w:r>
-        <w:t>pokrenutu</w:t>
-      </w:r>
-      <w:proofErr w:type="spellEnd"/>
-      <w:r>
-        <w:t xml:space="preserve"> </w:t>
-      </w:r>
-      <w:proofErr w:type="spellStart"/>
-      <w:r>
-        <w:t>instancu</w:t>
-      </w:r>
-      <w:proofErr w:type="spellEnd"/>
-      <w:r>
-        <w:t xml:space="preserve"> </w:t>
-      </w:r>
-      <w:proofErr w:type="spellStart"/>
-      <w:r>
-        <w:t>aplikacije</w:t>
-      </w:r>
-      <w:proofErr w:type="spellEnd"/>
-      <w:r>
-        <w:t xml:space="preserve"> </w:t>
-      </w:r>
-      <w:proofErr w:type="spellStart"/>
-      <w:r>
-        <w:t>ili</w:t>
-      </w:r>
-      <w:proofErr w:type="spellEnd"/>
-      <w:r>
-        <w:t xml:space="preserve"> </w:t>
-      </w:r>
-      <w:proofErr w:type="spellStart"/>
-      <w:r>
-        <w:t>koristiti</w:t>
-      </w:r>
-      <w:proofErr w:type="spellEnd"/>
-      <w:r>
-        <w:t xml:space="preserve"> </w:t>
-      </w:r>
-      <w:proofErr w:type="spellStart"/>
-      <w:r>
-        <w:t>drugi</w:t>
-      </w:r>
-      <w:proofErr w:type="spellEnd"/>
-      <w:r>
-        <w:t xml:space="preserve"> port.</w:t>
+        <w:t>Ako se aplikacija ne može pokrenuti zbog zauzetog porta, potrebno je ugasiti prethodno pokrenutu instancu aplikacije ili koristiti drugi port.</w:t>
       </w:r>
     </w:p>
     <w:p>
@@ -1732,119 +1076,210 @@
         <w:spacing w:after="100"/>
       </w:pPr>
       <w:r>
-        <w:t xml:space="preserve">Ako PostgreSQL </w:t>
+        <w:t>Ako PostgreSQL korisnik nema prava pristupa bazi, potrebno je koristiti korisnika koji ima odgovarajuće ovlasti nad bazom `fitness_studio`.</w:t>
       </w:r>
-      <w:proofErr w:type="spellStart"/>
+    </w:p>
+    <w:p>
+      <w:pPr>
+        <w:spacing w:after="100"/>
+        <w:ind w:left="360"/>
+      </w:pPr>
+    </w:p>
+    <w:p>
+      <w:pPr>
+        <w:pStyle w:val="Heading2"/>
+        <w:rPr>
+          <w:color w:val="1F497D" w:themeColor="text2"/>
+          <w:sz w:val="32"/>
+          <w:szCs w:val="32"/>
+        </w:rPr>
+      </w:pPr>
       <w:r>
-        <w:t>korisnik</w:t>
+        <w:rPr>
+          <w:color w:val="1F497D" w:themeColor="text2"/>
+          <w:sz w:val="32"/>
+          <w:szCs w:val="32"/>
+        </w:rPr>
+        <w:t>Pokretanje testova</w:t>
       </w:r>
-      <w:proofErr w:type="spellEnd"/>
+    </w:p>
+    <w:p/>
+    <w:p>
       <w:r>
-        <w:t xml:space="preserve"> </w:t>
+        <w:t>Za pokretanje testova prvo je potrebno podesiti connection string u datoteci:</w:t>
       </w:r>
-      <w:proofErr w:type="spellStart"/>
+    </w:p>
+    <w:p>
+      <w:pPr>
+        <w:pStyle w:val="p1"/>
+      </w:pPr>
       <w:r>
-        <w:t>nema</w:t>
+        <w:t xml:space="preserve">`FitnessStudio.Tests/Integration/PaketIntegrationTests.cs` promjeniti connection string: </w:t>
       </w:r>
-      <w:proofErr w:type="spellEnd"/>
+    </w:p>
+    <w:p>
+      <w:pPr>
+        <w:shd w:val="clear" w:color="auto" w:fill="121314"/>
+        <w:spacing w:line="270" w:lineRule="atLeast"/>
+        <w:rPr>
+          <w:rFonts w:ascii="Menlo" w:hAnsi="Menlo" w:cs="Menlo"/>
+          <w:color w:val="BBBEBF"/>
+          <w:sz w:val="18"/>
+          <w:szCs w:val="18"/>
+          <w:lang w:val="en-HR"/>
+        </w:rPr>
+      </w:pPr>
       <w:r>
-        <w:t xml:space="preserve"> </w:t>
+        <w:rPr>
+          <w:rFonts w:ascii="Menlo" w:hAnsi="Menlo" w:cs="Menlo"/>
+          <w:color w:val="BBBEBF"/>
+          <w:sz w:val="18"/>
+          <w:szCs w:val="18"/>
+        </w:rPr>
+        <w:t>{</w:t>
       </w:r>
-      <w:proofErr w:type="spellStart"/>
+    </w:p>
+    <w:p>
+      <w:pPr>
+        <w:shd w:val="clear" w:color="auto" w:fill="121314"/>
+        <w:spacing w:line="270" w:lineRule="atLeast"/>
+        <w:rPr>
+          <w:rFonts w:ascii="Menlo" w:hAnsi="Menlo" w:cs="Menlo"/>
+          <w:color w:val="BBBEBF"/>
+          <w:sz w:val="18"/>
+          <w:szCs w:val="18"/>
+        </w:rPr>
+      </w:pPr>
       <w:r>
-        <w:t>prava</w:t>
+        <w:rPr>
+          <w:rFonts w:ascii="Menlo" w:hAnsi="Menlo" w:cs="Menlo"/>
+          <w:color w:val="BBBEBF"/>
+          <w:sz w:val="18"/>
+          <w:szCs w:val="18"/>
+        </w:rPr>
+        <w:t xml:space="preserve">        </w:t>
       </w:r>
-      <w:proofErr w:type="spellEnd"/>
       <w:r>
-        <w:t xml:space="preserve"> </w:t>
+        <w:rPr>
+          <w:rFonts w:ascii="Menlo" w:hAnsi="Menlo" w:cs="Menlo"/>
+          <w:color w:val="A5D6FF"/>
+          <w:sz w:val="18"/>
+          <w:szCs w:val="18"/>
+        </w:rPr>
+        <w:t>"ConnectionStrings:DefaultConnection"</w:t>
       </w:r>
-      <w:proofErr w:type="spellStart"/>
       <w:r>
-        <w:t>pristupa</w:t>
+        <w:rPr>
+          <w:rFonts w:ascii="Menlo" w:hAnsi="Menlo" w:cs="Menlo"/>
+          <w:color w:val="BBBEBF"/>
+          <w:sz w:val="18"/>
+          <w:szCs w:val="18"/>
+        </w:rPr>
+        <w:t>,</w:t>
       </w:r>
-      <w:proofErr w:type="spellEnd"/>
+    </w:p>
+    <w:p>
+      <w:pPr>
+        <w:shd w:val="clear" w:color="auto" w:fill="121314"/>
+        <w:spacing w:line="270" w:lineRule="atLeast"/>
+        <w:rPr>
+          <w:rFonts w:ascii="Menlo" w:hAnsi="Menlo" w:cs="Menlo"/>
+          <w:color w:val="BBBEBF"/>
+          <w:sz w:val="18"/>
+          <w:szCs w:val="18"/>
+        </w:rPr>
+      </w:pPr>
       <w:r>
-        <w:t xml:space="preserve"> </w:t>
+        <w:rPr>
+          <w:rFonts w:ascii="Menlo" w:hAnsi="Menlo" w:cs="Menlo"/>
+          <w:color w:val="BBBEBF"/>
+          <w:sz w:val="18"/>
+          <w:szCs w:val="18"/>
+        </w:rPr>
+        <w:t xml:space="preserve">        </w:t>
       </w:r>
-      <w:proofErr w:type="spellStart"/>
       <w:r>
-        <w:t>bazi</w:t>
+        <w:rPr>
+          <w:rFonts w:ascii="Menlo" w:hAnsi="Menlo" w:cs="Menlo"/>
+          <w:color w:val="A5D6FF"/>
+          <w:sz w:val="18"/>
+          <w:szCs w:val="18"/>
+        </w:rPr>
+        <w:t>"Host=localhost;Port=5432;Database=fitness_studio;Username=postgres;Password=bazepodataka"</w:t>
       </w:r>
-      <w:proofErr w:type="spellEnd"/>
+    </w:p>
+    <w:p>
+      <w:pPr>
+        <w:shd w:val="clear" w:color="auto" w:fill="121314"/>
+        <w:spacing w:line="270" w:lineRule="atLeast"/>
+        <w:rPr>
+          <w:rFonts w:ascii="Menlo" w:hAnsi="Menlo" w:cs="Menlo"/>
+          <w:color w:val="BBBEBF"/>
+          <w:sz w:val="18"/>
+          <w:szCs w:val="18"/>
+        </w:rPr>
+      </w:pPr>
       <w:r>
-        <w:t xml:space="preserve">, </w:t>
+        <w:rPr>
+          <w:rFonts w:ascii="Menlo" w:hAnsi="Menlo" w:cs="Menlo"/>
+          <w:color w:val="BBBEBF"/>
+          <w:sz w:val="18"/>
+          <w:szCs w:val="18"/>
+        </w:rPr>
+        <w:t xml:space="preserve">    }</w:t>
       </w:r>
-      <w:proofErr w:type="spellStart"/>
+    </w:p>
+    <w:p>
+      <w:pPr>
+        <w:pStyle w:val="p1"/>
+        <w:numPr>
+          <w:ilvl w:val="0"/>
+          <w:numId w:val="11"/>
+        </w:numPr>
+      </w:pPr>
       <w:r>
-        <w:t>potrebno</w:t>
+        <w:t>Port: port na koji je spojen server vaše baze,</w:t>
       </w:r>
-      <w:proofErr w:type="spellEnd"/>
+    </w:p>
+    <w:p>
+      <w:pPr>
+        <w:pStyle w:val="p1"/>
+        <w:numPr>
+          <w:ilvl w:val="0"/>
+          <w:numId w:val="11"/>
+        </w:numPr>
+      </w:pPr>
       <w:r>
-        <w:t xml:space="preserve"> je </w:t>
+        <w:t xml:space="preserve"> Database: ime vaše baze, </w:t>
       </w:r>
-      <w:proofErr w:type="spellStart"/>
+    </w:p>
+    <w:p>
+      <w:pPr>
+        <w:pStyle w:val="p1"/>
+        <w:numPr>
+          <w:ilvl w:val="0"/>
+          <w:numId w:val="11"/>
+        </w:numPr>
+      </w:pPr>
       <w:r>
-        <w:t>koristiti</w:t>
+        <w:t xml:space="preserve">Username: ime korisnika, </w:t>
       </w:r>
-      <w:proofErr w:type="spellEnd"/>
+    </w:p>
+    <w:p>
+      <w:pPr>
+        <w:pStyle w:val="p1"/>
+        <w:numPr>
+          <w:ilvl w:val="0"/>
+          <w:numId w:val="11"/>
+        </w:numPr>
+      </w:pPr>
       <w:r>
-        <w:t xml:space="preserve"> </w:t>
+        <w:t>Password: vaša lozinka</w:t>
       </w:r>
-      <w:proofErr w:type="spellStart"/>
+    </w:p>
+    <w:p>
       <w:r>
-        <w:t>korisnika</w:t>
-      </w:r>
-      <w:proofErr w:type="spellEnd"/>
-      <w:r>
-        <w:t xml:space="preserve"> koji </w:t>
-      </w:r>
-      <w:proofErr w:type="spellStart"/>
-      <w:r>
-        <w:t>ima</w:t>
-      </w:r>
-      <w:proofErr w:type="spellEnd"/>
-      <w:r>
-        <w:t xml:space="preserve"> </w:t>
-      </w:r>
-      <w:proofErr w:type="spellStart"/>
-      <w:r>
-        <w:t>odgovarajuće</w:t>
-      </w:r>
-      <w:proofErr w:type="spellEnd"/>
-      <w:r>
-        <w:t xml:space="preserve"> </w:t>
-      </w:r>
-      <w:proofErr w:type="spellStart"/>
-      <w:r>
-        <w:t>ovlasti</w:t>
-      </w:r>
-      <w:proofErr w:type="spellEnd"/>
-      <w:r>
-        <w:t xml:space="preserve"> </w:t>
-      </w:r>
-      <w:proofErr w:type="spellStart"/>
-      <w:r>
-        <w:t>nad</w:t>
-      </w:r>
-      <w:proofErr w:type="spellEnd"/>
-      <w:r>
-        <w:t xml:space="preserve"> </w:t>
-      </w:r>
-      <w:proofErr w:type="spellStart"/>
-      <w:r>
-        <w:t>bazom</w:t>
-      </w:r>
-      <w:proofErr w:type="spellEnd"/>
-      <w:r>
-        <w:t xml:space="preserve"> `</w:t>
-      </w:r>
-      <w:proofErr w:type="spellStart"/>
-      <w:r>
-        <w:t>fitness_studio</w:t>
-      </w:r>
-      <w:proofErr w:type="spellEnd"/>
-      <w:r>
-        <w:t>`.</w:t>
+        <w:t>Nakon podešavanja connection stringa, testove možete pokrenuti iz terminala naredbom:  dotnet test</w:t>
       </w:r>
     </w:p>
     <w:sectPr>
@@ -2034,6 +1469,119 @@
     <w:nsid w:val="0F526068"/>
     <w:multiLevelType w:val="hybridMultilevel"/>
     <w:tmpl w:val="F61EA1FE"/>
+    <w:lvl w:ilvl="0" w:tplc="08090001">
+      <w:start w:val="1"/>
+      <w:numFmt w:val="bullet"/>
+      <w:lvlText w:val=""/>
+      <w:lvlJc w:val="left"/>
+      <w:pPr>
+        <w:ind w:left="720" w:hanging="360"/>
+      </w:pPr>
+      <w:rPr>
+        <w:rFonts w:ascii="Symbol" w:hAnsi="Symbol" w:hint="default"/>
+      </w:rPr>
+    </w:lvl>
+    <w:lvl w:ilvl="1" w:tplc="08090003" w:tentative="1">
+      <w:start w:val="1"/>
+      <w:numFmt w:val="bullet"/>
+      <w:lvlText w:val="o"/>
+      <w:lvlJc w:val="left"/>
+      <w:pPr>
+        <w:ind w:left="1440" w:hanging="360"/>
+      </w:pPr>
+      <w:rPr>
+        <w:rFonts w:ascii="Courier New" w:hAnsi="Courier New" w:cs="Courier New" w:hint="default"/>
+      </w:rPr>
+    </w:lvl>
+    <w:lvl w:ilvl="2" w:tplc="08090005" w:tentative="1">
+      <w:start w:val="1"/>
+      <w:numFmt w:val="bullet"/>
+      <w:lvlText w:val=""/>
+      <w:lvlJc w:val="left"/>
+      <w:pPr>
+        <w:ind w:left="2160" w:hanging="360"/>
+      </w:pPr>
+      <w:rPr>
+        <w:rFonts w:ascii="Wingdings" w:hAnsi="Wingdings" w:hint="default"/>
+      </w:rPr>
+    </w:lvl>
+    <w:lvl w:ilvl="3" w:tplc="08090001" w:tentative="1">
+      <w:start w:val="1"/>
+      <w:numFmt w:val="bullet"/>
+      <w:lvlText w:val=""/>
+      <w:lvlJc w:val="left"/>
+      <w:pPr>
+        <w:ind w:left="2880" w:hanging="360"/>
+      </w:pPr>
+      <w:rPr>
+        <w:rFonts w:ascii="Symbol" w:hAnsi="Symbol" w:hint="default"/>
+      </w:rPr>
+    </w:lvl>
+    <w:lvl w:ilvl="4" w:tplc="08090003" w:tentative="1">
+      <w:start w:val="1"/>
+      <w:numFmt w:val="bullet"/>
+      <w:lvlText w:val="o"/>
+      <w:lvlJc w:val="left"/>
+      <w:pPr>
+        <w:ind w:left="3600" w:hanging="360"/>
+      </w:pPr>
+      <w:rPr>
+        <w:rFonts w:ascii="Courier New" w:hAnsi="Courier New" w:cs="Courier New" w:hint="default"/>
+      </w:rPr>
+    </w:lvl>
+    <w:lvl w:ilvl="5" w:tplc="08090005" w:tentative="1">
+      <w:start w:val="1"/>
+      <w:numFmt w:val="bullet"/>
+      <w:lvlText w:val=""/>
+      <w:lvlJc w:val="left"/>
+      <w:pPr>
+        <w:ind w:left="4320" w:hanging="360"/>
+      </w:pPr>
+      <w:rPr>
+        <w:rFonts w:ascii="Wingdings" w:hAnsi="Wingdings" w:hint="default"/>
+      </w:rPr>
+    </w:lvl>
+    <w:lvl w:ilvl="6" w:tplc="08090001" w:tentative="1">
+      <w:start w:val="1"/>
+      <w:numFmt w:val="bullet"/>
+      <w:lvlText w:val=""/>
+      <w:lvlJc w:val="left"/>
+      <w:pPr>
+        <w:ind w:left="5040" w:hanging="360"/>
+      </w:pPr>
+      <w:rPr>
+        <w:rFonts w:ascii="Symbol" w:hAnsi="Symbol" w:hint="default"/>
+      </w:rPr>
+    </w:lvl>
+    <w:lvl w:ilvl="7" w:tplc="08090003" w:tentative="1">
+      <w:start w:val="1"/>
+      <w:numFmt w:val="bullet"/>
+      <w:lvlText w:val="o"/>
+      <w:lvlJc w:val="left"/>
+      <w:pPr>
+        <w:ind w:left="5760" w:hanging="360"/>
+      </w:pPr>
+      <w:rPr>
+        <w:rFonts w:ascii="Courier New" w:hAnsi="Courier New" w:cs="Courier New" w:hint="default"/>
+      </w:rPr>
+    </w:lvl>
+    <w:lvl w:ilvl="8" w:tplc="08090005" w:tentative="1">
+      <w:start w:val="1"/>
+      <w:numFmt w:val="bullet"/>
+      <w:lvlText w:val=""/>
+      <w:lvlJc w:val="left"/>
+      <w:pPr>
+        <w:ind w:left="6480" w:hanging="360"/>
+      </w:pPr>
+      <w:rPr>
+        <w:rFonts w:ascii="Wingdings" w:hAnsi="Wingdings" w:hint="default"/>
+      </w:rPr>
+    </w:lvl>
+  </w:abstractNum>
+  <w:abstractNum w:abstractNumId="10" w15:restartNumberingAfterBreak="0">
+    <w:nsid w:val="2014543D"/>
+    <w:multiLevelType w:val="hybridMultilevel"/>
+    <w:tmpl w:val="C6DC6F22"/>
     <w:lvl w:ilvl="0" w:tplc="08090001">
       <w:start w:val="1"/>
       <w:numFmt w:val="bullet"/>
@@ -2172,6 +1720,9 @@
   </w:num>
   <w:num w:numId="10" w16cid:durableId="204559542">
     <w:abstractNumId w:val="9"/>
+  </w:num>
+  <w:num w:numId="11" w16cid:durableId="2115781837">
+    <w:abstractNumId w:val="10"/>
   </w:num>
 </w:numbering>
 </file>
@@ -13561,6 +13112,20 @@
       </w:tcPr>
     </w:tblStylePr>
   </w:style>
+  <w:style w:type="paragraph" w:customStyle="1" w:styleId="p1">
+    <w:name w:val="p1"/>
+    <w:basedOn w:val="Normal"/>
+    <w:rsid w:val="00F75A84"/>
+    <w:pPr>
+      <w:spacing w:before="100" w:beforeAutospacing="1" w:after="100" w:afterAutospacing="1" w:line="240" w:lineRule="auto"/>
+    </w:pPr>
+    <w:rPr>
+      <w:rFonts w:ascii="Times New Roman" w:eastAsia="Times New Roman" w:hAnsi="Times New Roman" w:cs="Times New Roman"/>
+      <w:sz w:val="24"/>
+      <w:szCs w:val="24"/>
+      <w:lang w:val="hr-HR" w:eastAsia="en-GB"/>
+    </w:rPr>
+  </w:style>
 </w:styles>
 </file>
 

</xml_diff>